<commit_message>
Perbaikan template surat pernyataan
</commit_message>
<xml_diff>
--- a/SIPETO25/public/template/surat_pernyataan.docx
+++ b/SIPETO25/public/template/surat_pernyataan.docx
@@ -446,7 +446,7 @@
           </mc:Choice>
           <mc:Fallback>
             <w:pict>
-              <v:group w14:anchorId="116E483C" id="Group 2" o:spid="_x0000_s1026" style="width:464.05pt;height:2.2pt;mso-position-horizontal-relative:char;mso-position-vertical-relative:line" coordsize="58934,279" o:gfxdata="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">
+              <v:group w14:anchorId="3C539E27" id="Group 2" o:spid="_x0000_s1026" style="width:464.05pt;height:2.2pt;mso-position-horizontal-relative:char;mso-position-vertical-relative:line" coordsize="58934,279" o:gfxdata="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">
                 <v:shape id="Graphic 3" o:spid="_x0000_s1027" style="position:absolute;width:58934;height:279;visibility:visible;mso-wrap-style:square;v-text-anchor:top" coordsize="5893435,27940" o:gfxdata="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" path="m814057,l786688,,,,,27419r786638,l814057,27419,814057,xem5892927,l814070,r,27419l5892927,27419r,-27419xe" fillcolor="black" stroked="f">
                   <v:path arrowok="t"/>
                 </v:shape>
@@ -612,7 +612,7 @@
               <w:rPr>
                 <w:sz w:val="24"/>
               </w:rPr>
-              <w:t>/PL2.</w:t>
+              <w:t>.</w:t>
             </w:r>
             <w:r>
               <w:rPr>
@@ -2098,10 +2098,7 @@
         <w:t>Kepala UPA Bahasa</w:t>
       </w:r>
       <w:r>
-        <w:t xml:space="preserve"> </w:t>
-      </w:r>
-      <w:r>
-        <w:t>${tanggal_surat}</w:t>
+        <w:t xml:space="preserve"> ${tanggal_surat}</w:t>
       </w:r>
     </w:p>
     <w:p>

</xml_diff>